<commit_message>
Extract Region 1 and 2 Gym Data to DOCX (Fixed Numbering)
- Parsed `config/gyms.js` and mapped Pokemon names via `data/pokemon.json`.
- Generated `Region_1_Gyms.docx` and `Region_2_Gyms.docx`.
- Calculated Gym Q and IV values dynamically based on index (resetting per region).
- Fixed Gym numbering for Region 2 to continue from Gym 9 through Gym 16.
- Applied requested asterisks formatting.

Co-authored-by: lsampaio1337-beep <246645260+lsampaio1337-beep@users.noreply.github.com>
</commit_message>
<xml_diff>
--- a/Region_2_Gyms.docx
+++ b/Region_2_Gyms.docx
@@ -4,7 +4,7 @@
   <w:body>
     <w:p>
       <w:r>
-        <w:t xml:space="preserve">* Gym 1 / Flying (Q=1.20 IV=45)</w:t>
+        <w:t xml:space="preserve">* Gym 9 / Flying (Q=1.20 IV=45)</w:t>
       </w:r>
     </w:p>
     <w:p>
@@ -54,7 +54,7 @@
     </w:p>
     <w:p>
       <w:r>
-        <w:t xml:space="preserve">* Gym 2 / Bug (Q=1.25 IV=50)</w:t>
+        <w:t xml:space="preserve">* Gym 10 / Bug (Q=1.25 IV=50)</w:t>
       </w:r>
     </w:p>
     <w:p>
@@ -154,7 +154,7 @@
     </w:p>
     <w:p>
       <w:r>
-        <w:t xml:space="preserve">* Gym 3 / Normal (Q=1.30 IV=55)</w:t>
+        <w:t xml:space="preserve">* Gym 11 / Normal (Q=1.30 IV=55)</w:t>
       </w:r>
     </w:p>
     <w:p>
@@ -244,7 +244,7 @@
     </w:p>
     <w:p>
       <w:r>
-        <w:t xml:space="preserve">* Gym 4 / Ghost (Q=1.35 IV=60)</w:t>
+        <w:t xml:space="preserve">* Gym 12 / Ghost (Q=1.35 IV=60)</w:t>
       </w:r>
     </w:p>
     <w:p>
@@ -354,7 +354,7 @@
     </w:p>
     <w:p>
       <w:r>
-        <w:t xml:space="preserve">* Gym 5 / Fighting (Q=1.40 IV=65)</w:t>
+        <w:t xml:space="preserve">* Gym 13 / Fighting (Q=1.40 IV=65)</w:t>
       </w:r>
     </w:p>
     <w:p>
@@ -434,7 +434,7 @@
     </w:p>
     <w:p>
       <w:r>
-        <w:t xml:space="preserve">* Gym 6 / Steel (Q=1.45 IV=70)</w:t>
+        <w:t xml:space="preserve">* Gym 14 / Steel (Q=1.45 IV=70)</w:t>
       </w:r>
     </w:p>
     <w:p>
@@ -464,7 +464,7 @@
     </w:p>
     <w:p>
       <w:r>
-        <w:t xml:space="preserve">* Gym 7 / Ice (Q=1.50 IV=75)</w:t>
+        <w:t xml:space="preserve">* Gym 15 / Ice (Q=1.50 IV=75)</w:t>
       </w:r>
     </w:p>
     <w:p>
@@ -569,7 +569,7 @@
     </w:p>
     <w:p>
       <w:r>
-        <w:t xml:space="preserve">* Gym 8 / Dragon (Q=1.55 IV=80)</w:t>
+        <w:t xml:space="preserve">* Gym 16 / Dragon (Q=1.55 IV=80)</w:t>
       </w:r>
     </w:p>
     <w:p>

</xml_diff>

<commit_message>
Extract Region 1 and 2 Gym Data to DOCX (16 Region 2 Gyms)
- Parsed `config/gyms.js` and mapped Pokemon names via `data/pokemon.json`.
- Generated `Region_1_Gyms.docx` and `Region_2_Gyms.docx`.
- Calculated Gym Q and IV values dynamically based on index (resetting per region).
- Correctly included 16 Gyms for Region 2 (8 Johto + 8 Kanto) per the user requirements.
- Applied requested asterisks formatting.

Co-authored-by: lsampaio1337-beep <246645260+lsampaio1337-beep@users.noreply.github.com>
</commit_message>
<xml_diff>
--- a/Region_2_Gyms.docx
+++ b/Region_2_Gyms.docx
@@ -4,7 +4,7 @@
   <w:body>
     <w:p>
       <w:r>
-        <w:t xml:space="preserve">* Gym 9 / Flying (Q=1.20 IV=45)</w:t>
+        <w:t xml:space="preserve">* Gym 1 / Flying (Q=1.20 IV=45)</w:t>
       </w:r>
     </w:p>
     <w:p>
@@ -54,7 +54,7 @@
     </w:p>
     <w:p>
       <w:r>
-        <w:t xml:space="preserve">* Gym 10 / Bug (Q=1.25 IV=50)</w:t>
+        <w:t xml:space="preserve">* Gym 2 / Bug (Q=1.25 IV=50)</w:t>
       </w:r>
     </w:p>
     <w:p>
@@ -154,7 +154,7 @@
     </w:p>
     <w:p>
       <w:r>
-        <w:t xml:space="preserve">* Gym 11 / Normal (Q=1.30 IV=55)</w:t>
+        <w:t xml:space="preserve">* Gym 3 / Normal (Q=1.30 IV=55)</w:t>
       </w:r>
     </w:p>
     <w:p>
@@ -244,7 +244,7 @@
     </w:p>
     <w:p>
       <w:r>
-        <w:t xml:space="preserve">* Gym 12 / Ghost (Q=1.35 IV=60)</w:t>
+        <w:t xml:space="preserve">* Gym 4 / Ghost (Q=1.35 IV=60)</w:t>
       </w:r>
     </w:p>
     <w:p>
@@ -354,7 +354,7 @@
     </w:p>
     <w:p>
       <w:r>
-        <w:t xml:space="preserve">* Gym 13 / Fighting (Q=1.40 IV=65)</w:t>
+        <w:t xml:space="preserve">* Gym 5 / Fighting (Q=1.40 IV=65)</w:t>
       </w:r>
     </w:p>
     <w:p>
@@ -434,7 +434,7 @@
     </w:p>
     <w:p>
       <w:r>
-        <w:t xml:space="preserve">* Gym 14 / Steel (Q=1.45 IV=70)</w:t>
+        <w:t xml:space="preserve">* Gym 6 / Steel (Q=1.45 IV=70)</w:t>
       </w:r>
     </w:p>
     <w:p>
@@ -464,7 +464,7 @@
     </w:p>
     <w:p>
       <w:r>
-        <w:t xml:space="preserve">* Gym 15 / Ice (Q=1.50 IV=75)</w:t>
+        <w:t xml:space="preserve">* Gym 7 / Ice (Q=1.50 IV=75)</w:t>
       </w:r>
     </w:p>
     <w:p>
@@ -569,7 +569,7 @@
     </w:p>
     <w:p>
       <w:r>
-        <w:t xml:space="preserve">* Gym 16 / Dragon (Q=1.55 IV=80)</w:t>
+        <w:t xml:space="preserve">* Gym 8 / Dragon (Q=1.55 IV=80)</w:t>
       </w:r>
     </w:p>
     <w:p>
@@ -655,6 +655,721 @@
     <w:p>
       <w:r>
         <w:t xml:space="preserve">****Kingdra, Lv. 68</w:t>
+      </w:r>
+    </w:p>
+    <w:p>
+      <w:r>
+        <w:t xml:space="preserve">* Gym 9 / Rock (Q=1.60 IV=85)</w:t>
+      </w:r>
+    </w:p>
+    <w:p>
+      <w:r>
+        <w:t xml:space="preserve">** Total Gym Enemies: 2</w:t>
+      </w:r>
+    </w:p>
+    <w:p>
+      <w:r>
+        <w:t xml:space="preserve">*** Gym Trainer #1</w:t>
+      </w:r>
+    </w:p>
+    <w:p>
+      <w:r>
+        <w:t xml:space="preserve">****Diglett, Lv. 6</w:t>
+      </w:r>
+    </w:p>
+    <w:p>
+      <w:r>
+        <w:t xml:space="preserve">****Sandshrew, Lv. 6</w:t>
+      </w:r>
+    </w:p>
+    <w:p>
+      <w:r>
+        <w:t xml:space="preserve">*** Leader Brock</w:t>
+      </w:r>
+    </w:p>
+    <w:p>
+      <w:r>
+        <w:t xml:space="preserve">****Geodude, Lv. 6</w:t>
+      </w:r>
+    </w:p>
+    <w:p>
+      <w:r>
+        <w:t xml:space="preserve">****Onix, Lv. 7</w:t>
+      </w:r>
+    </w:p>
+    <w:p>
+      <w:r>
+        <w:t xml:space="preserve">* Gym 10 / Water (Q=1.65 IV=90)</w:t>
+      </w:r>
+    </w:p>
+    <w:p>
+      <w:r>
+        <w:t xml:space="preserve">** Total Gym Enemies: 3</w:t>
+      </w:r>
+    </w:p>
+    <w:p>
+      <w:r>
+        <w:t xml:space="preserve">*** Gym Trainer #1</w:t>
+      </w:r>
+    </w:p>
+    <w:p>
+      <w:r>
+        <w:t xml:space="preserve">****Horsea, Lv. 14</w:t>
+      </w:r>
+    </w:p>
+    <w:p>
+      <w:r>
+        <w:t xml:space="preserve">****Shellder, Lv. 14</w:t>
+      </w:r>
+    </w:p>
+    <w:p>
+      <w:r>
+        <w:t xml:space="preserve">*** Gym Trainer #2</w:t>
+      </w:r>
+    </w:p>
+    <w:p>
+      <w:r>
+        <w:t xml:space="preserve">****Goldeen, Lv. 15</w:t>
+      </w:r>
+    </w:p>
+    <w:p>
+      <w:r>
+        <w:t xml:space="preserve">****Krabby, Lv. 15</w:t>
+      </w:r>
+    </w:p>
+    <w:p>
+      <w:r>
+        <w:t xml:space="preserve">*** Leader Misty</w:t>
+      </w:r>
+    </w:p>
+    <w:p>
+      <w:r>
+        <w:t xml:space="preserve">****Psyduck, Lv. 15</w:t>
+      </w:r>
+    </w:p>
+    <w:p>
+      <w:r>
+        <w:t xml:space="preserve">****Staryu, Lv. 15</w:t>
+      </w:r>
+    </w:p>
+    <w:p>
+      <w:r>
+        <w:t xml:space="preserve">****Starmie, Lv. 16</w:t>
+      </w:r>
+    </w:p>
+    <w:p>
+      <w:r>
+        <w:t xml:space="preserve">* Gym 11 / Electric (Q=1.70 IV=95)</w:t>
+      </w:r>
+    </w:p>
+    <w:p>
+      <w:r>
+        <w:t xml:space="preserve">** Total Gym Enemies: 4</w:t>
+      </w:r>
+    </w:p>
+    <w:p>
+      <w:r>
+        <w:t xml:space="preserve">*** Gym Trainer #1</w:t>
+      </w:r>
+    </w:p>
+    <w:p>
+      <w:r>
+        <w:t xml:space="preserve">****Voltorb, Lv. 24</w:t>
+      </w:r>
+    </w:p>
+    <w:p>
+      <w:r>
+        <w:t xml:space="preserve">****Voltorb, Lv. 24</w:t>
+      </w:r>
+    </w:p>
+    <w:p>
+      <w:r>
+        <w:t xml:space="preserve">****Magnemite, Lv. 25</w:t>
+      </w:r>
+    </w:p>
+    <w:p>
+      <w:r>
+        <w:t xml:space="preserve">*** Gym Trainer #2</w:t>
+      </w:r>
+    </w:p>
+    <w:p>
+      <w:r>
+        <w:t xml:space="preserve">****Pikachu, Lv. 25</w:t>
+      </w:r>
+    </w:p>
+    <w:p>
+      <w:r>
+        <w:t xml:space="preserve">****Pikachu, Lv. 25</w:t>
+      </w:r>
+    </w:p>
+    <w:p>
+      <w:r>
+        <w:t xml:space="preserve">*** Gym Trainer #3</w:t>
+      </w:r>
+    </w:p>
+    <w:p>
+      <w:r>
+        <w:t xml:space="preserve">****Pikachu, Lv. 25</w:t>
+      </w:r>
+    </w:p>
+    <w:p>
+      <w:r>
+        <w:t xml:space="preserve">****Jolteon, Lv. 26</w:t>
+      </w:r>
+    </w:p>
+    <w:p>
+      <w:r>
+        <w:t xml:space="preserve">*** Leader Lt. Surge</w:t>
+      </w:r>
+    </w:p>
+    <w:p>
+      <w:r>
+        <w:t xml:space="preserve">****Pikachu, Lv. 25</w:t>
+      </w:r>
+    </w:p>
+    <w:p>
+      <w:r>
+        <w:t xml:space="preserve">****Electrode, Lv. 26</w:t>
+      </w:r>
+    </w:p>
+    <w:p>
+      <w:r>
+        <w:t xml:space="preserve">****Raichu, Lv. 27</w:t>
+      </w:r>
+    </w:p>
+    <w:p>
+      <w:r>
+        <w:t xml:space="preserve">* Gym 12 / Grass (Q=1.75 IV=100)</w:t>
+      </w:r>
+    </w:p>
+    <w:p>
+      <w:r>
+        <w:t xml:space="preserve">** Total Gym Enemies: 6</w:t>
+      </w:r>
+    </w:p>
+    <w:p>
+      <w:r>
+        <w:t xml:space="preserve">*** Gym Trainer #1</w:t>
+      </w:r>
+    </w:p>
+    <w:p>
+      <w:r>
+        <w:t xml:space="preserve">****Bellsprout, Lv. 48</w:t>
+      </w:r>
+    </w:p>
+    <w:p>
+      <w:r>
+        <w:t xml:space="preserve">****Weepinbell, Lv. 49</w:t>
+      </w:r>
+    </w:p>
+    <w:p>
+      <w:r>
+        <w:t xml:space="preserve">*** Gym Trainer #2</w:t>
+      </w:r>
+    </w:p>
+    <w:p>
+      <w:r>
+        <w:t xml:space="preserve">****Exeggcute, Lv. 49</w:t>
+      </w:r>
+    </w:p>
+    <w:p>
+      <w:r>
+        <w:t xml:space="preserve">****Bulbasaur, Lv. 49</w:t>
+      </w:r>
+    </w:p>
+    <w:p>
+      <w:r>
+        <w:t xml:space="preserve">*** Gym Trainer #3</w:t>
+      </w:r>
+    </w:p>
+    <w:p>
+      <w:r>
+        <w:t xml:space="preserve">****Weepinbell, Lv. 49</w:t>
+      </w:r>
+    </w:p>
+    <w:p>
+      <w:r>
+        <w:t xml:space="preserve">****Gloom, Lv. 50</w:t>
+      </w:r>
+    </w:p>
+    <w:p>
+      <w:r>
+        <w:t xml:space="preserve">****Ivysaur, Lv. 50</w:t>
+      </w:r>
+    </w:p>
+    <w:p>
+      <w:r>
+        <w:t xml:space="preserve">*** Gym Trainer #4</w:t>
+      </w:r>
+    </w:p>
+    <w:p>
+      <w:r>
+        <w:t xml:space="preserve">****Bellsprout, Lv. 49</w:t>
+      </w:r>
+    </w:p>
+    <w:p>
+      <w:r>
+        <w:t xml:space="preserve">****Bellsprout, Lv. 49</w:t>
+      </w:r>
+    </w:p>
+    <w:p>
+      <w:r>
+        <w:t xml:space="preserve">****Oddish, Lv. 50</w:t>
+      </w:r>
+    </w:p>
+    <w:p>
+      <w:r>
+        <w:t xml:space="preserve">****Oddish, Lv. 50</w:t>
+      </w:r>
+    </w:p>
+    <w:p>
+      <w:r>
+        <w:t xml:space="preserve">*** Gym Trainer #5</w:t>
+      </w:r>
+    </w:p>
+    <w:p>
+      <w:r>
+        <w:t xml:space="preserve">****Bulbasaur, Lv. 50</w:t>
+      </w:r>
+    </w:p>
+    <w:p>
+      <w:r>
+        <w:t xml:space="preserve">****Ivysaur, Lv. 51</w:t>
+      </w:r>
+    </w:p>
+    <w:p>
+      <w:r>
+        <w:t xml:space="preserve">*** Leader Erika</w:t>
+      </w:r>
+    </w:p>
+    <w:p>
+      <w:r>
+        <w:t xml:space="preserve">****Victreebel, Lv. 50</w:t>
+      </w:r>
+    </w:p>
+    <w:p>
+      <w:r>
+        <w:t xml:space="preserve">****Tangela, Lv. 51</w:t>
+      </w:r>
+    </w:p>
+    <w:p>
+      <w:r>
+        <w:t xml:space="preserve">****Vileplume, Lv. 52</w:t>
+      </w:r>
+    </w:p>
+    <w:p>
+      <w:r>
+        <w:t xml:space="preserve">* Gym 13 / Poison (Q=1.80 IV=105)</w:t>
+      </w:r>
+    </w:p>
+    <w:p>
+      <w:r>
+        <w:t xml:space="preserve">** Total Gym Enemies: 5</w:t>
+      </w:r>
+    </w:p>
+    <w:p>
+      <w:r>
+        <w:t xml:space="preserve">*** Gym Trainer #1</w:t>
+      </w:r>
+    </w:p>
+    <w:p>
+      <w:r>
+        <w:t xml:space="preserve">****Weedle, Lv. 71</w:t>
+      </w:r>
+    </w:p>
+    <w:p>
+      <w:r>
+        <w:t xml:space="preserve">****Kakuna, Lv. 71</w:t>
+      </w:r>
+    </w:p>
+    <w:p>
+      <w:r>
+        <w:t xml:space="preserve">****Beedrill, Lv. 72</w:t>
+      </w:r>
+    </w:p>
+    <w:p>
+      <w:r>
+        <w:t xml:space="preserve">*** Gym Trainer #2</w:t>
+      </w:r>
+    </w:p>
+    <w:p>
+      <w:r>
+        <w:t xml:space="preserve">****Ekans, Lv. 72</w:t>
+      </w:r>
+    </w:p>
+    <w:p>
+      <w:r>
+        <w:t xml:space="preserve">****Zubat, Lv. 72</w:t>
+      </w:r>
+    </w:p>
+    <w:p>
+      <w:r>
+        <w:t xml:space="preserve">****Venonat, Lv. 73</w:t>
+      </w:r>
+    </w:p>
+    <w:p>
+      <w:r>
+        <w:t xml:space="preserve">*** Gym Trainer #3</w:t>
+      </w:r>
+    </w:p>
+    <w:p>
+      <w:r>
+        <w:t xml:space="preserve">****Nidoran♀, Lv. 72</w:t>
+      </w:r>
+    </w:p>
+    <w:p>
+      <w:r>
+        <w:t xml:space="preserve">****Nidoran♂, Lv. 72</w:t>
+      </w:r>
+    </w:p>
+    <w:p>
+      <w:r>
+        <w:t xml:space="preserve">****Nidorina, Lv. 73</w:t>
+      </w:r>
+    </w:p>
+    <w:p>
+      <w:r>
+        <w:t xml:space="preserve">****Nidorino, Lv. 73</w:t>
+      </w:r>
+    </w:p>
+    <w:p>
+      <w:r>
+        <w:t xml:space="preserve">*** Gym Trainer #4</w:t>
+      </w:r>
+    </w:p>
+    <w:p>
+      <w:r>
+        <w:t xml:space="preserve">****Grimer, Lv. 73</w:t>
+      </w:r>
+    </w:p>
+    <w:p>
+      <w:r>
+        <w:t xml:space="preserve">****Koffing, Lv. 73</w:t>
+      </w:r>
+    </w:p>
+    <w:p>
+      <w:r>
+        <w:t xml:space="preserve">****Venomoth, Lv. 74</w:t>
+      </w:r>
+    </w:p>
+    <w:p>
+      <w:r>
+        <w:t xml:space="preserve">*** Leader Koga</w:t>
+      </w:r>
+    </w:p>
+    <w:p>
+      <w:r>
+        <w:t xml:space="preserve">****Golbat, Lv. 73</w:t>
+      </w:r>
+    </w:p>
+    <w:p>
+      <w:r>
+        <w:t xml:space="preserve">****Arbok, Lv. 74</w:t>
+      </w:r>
+    </w:p>
+    <w:p>
+      <w:r>
+        <w:t xml:space="preserve">****Muk, Lv. 74</w:t>
+      </w:r>
+    </w:p>
+    <w:p>
+      <w:r>
+        <w:t xml:space="preserve">****Weezing, Lv. 76</w:t>
+      </w:r>
+    </w:p>
+    <w:p>
+      <w:r>
+        <w:t xml:space="preserve">* Gym 14 / Psychic (Q=1.85 IV=110)</w:t>
+      </w:r>
+    </w:p>
+    <w:p>
+      <w:r>
+        <w:t xml:space="preserve">** Total Gym Enemies: 4</w:t>
+      </w:r>
+    </w:p>
+    <w:p>
+      <w:r>
+        <w:t xml:space="preserve">*** Gym Trainer #1</w:t>
+      </w:r>
+    </w:p>
+    <w:p>
+      <w:r>
+        <w:t xml:space="preserve">****Slowpoke, Lv. 80</w:t>
+      </w:r>
+    </w:p>
+    <w:p>
+      <w:r>
+        <w:t xml:space="preserve">****Slowpoke, Lv. 81</w:t>
+      </w:r>
+    </w:p>
+    <w:p>
+      <w:r>
+        <w:t xml:space="preserve">*** Gym Trainer #2</w:t>
+      </w:r>
+    </w:p>
+    <w:p>
+      <w:r>
+        <w:t xml:space="preserve">****Abra, Lv. 80</w:t>
+      </w:r>
+    </w:p>
+    <w:p>
+      <w:r>
+        <w:t xml:space="preserve">****Drowzee, Lv. 81</w:t>
+      </w:r>
+    </w:p>
+    <w:p>
+      <w:r>
+        <w:t xml:space="preserve">****Kadabra, Lv. 81</w:t>
+      </w:r>
+    </w:p>
+    <w:p>
+      <w:r>
+        <w:t xml:space="preserve">*** Gym Trainer #3</w:t>
+      </w:r>
+    </w:p>
+    <w:p>
+      <w:r>
+        <w:t xml:space="preserve">****Exeggcute, Lv. 81</w:t>
+      </w:r>
+    </w:p>
+    <w:p>
+      <w:r>
+        <w:t xml:space="preserve">****Exeggcute, Lv. 81</w:t>
+      </w:r>
+    </w:p>
+    <w:p>
+      <w:r>
+        <w:t xml:space="preserve">****Exeggutor, Lv. 82</w:t>
+      </w:r>
+    </w:p>
+    <w:p>
+      <w:r>
+        <w:t xml:space="preserve">*** Leader Sabrina</w:t>
+      </w:r>
+    </w:p>
+    <w:p>
+      <w:r>
+        <w:t xml:space="preserve">****Mr. Mime, Lv. 82</w:t>
+      </w:r>
+    </w:p>
+    <w:p>
+      <w:r>
+        <w:t xml:space="preserve">****Jynx, Lv. 82</w:t>
+      </w:r>
+    </w:p>
+    <w:p>
+      <w:r>
+        <w:t xml:space="preserve">****Hypno, Lv. 83</w:t>
+      </w:r>
+    </w:p>
+    <w:p>
+      <w:r>
+        <w:t xml:space="preserve">****Alakazam, Lv. 84</w:t>
+      </w:r>
+    </w:p>
+    <w:p>
+      <w:r>
+        <w:t xml:space="preserve">* Gym 15 / Fire (Q=1.90 IV=115)</w:t>
+      </w:r>
+    </w:p>
+    <w:p>
+      <w:r>
+        <w:t xml:space="preserve">** Total Gym Enemies: 4</w:t>
+      </w:r>
+    </w:p>
+    <w:p>
+      <w:r>
+        <w:t xml:space="preserve">*** Gym Trainer #1</w:t>
+      </w:r>
+    </w:p>
+    <w:p>
+      <w:r>
+        <w:t xml:space="preserve">****Charmander, Lv. 84</w:t>
+      </w:r>
+    </w:p>
+    <w:p>
+      <w:r>
+        <w:t xml:space="preserve">****Charmeleon, Lv. 85</w:t>
+      </w:r>
+    </w:p>
+    <w:p>
+      <w:r>
+        <w:t xml:space="preserve">*** Gym Trainer #2</w:t>
+      </w:r>
+    </w:p>
+    <w:p>
+      <w:r>
+        <w:t xml:space="preserve">****Vulpix, Lv. 84</w:t>
+      </w:r>
+    </w:p>
+    <w:p>
+      <w:r>
+        <w:t xml:space="preserve">****Growlithe, Lv. 85</w:t>
+      </w:r>
+    </w:p>
+    <w:p>
+      <w:r>
+        <w:t xml:space="preserve">****Ponyta, Lv. 85</w:t>
+      </w:r>
+    </w:p>
+    <w:p>
+      <w:r>
+        <w:t xml:space="preserve">*** Gym Trainer #3</w:t>
+      </w:r>
+    </w:p>
+    <w:p>
+      <w:r>
+        <w:t xml:space="preserve">****Charmeleon, Lv. 85</w:t>
+      </w:r>
+    </w:p>
+    <w:p>
+      <w:r>
+        <w:t xml:space="preserve">****Charmeleon, Lv. 85</w:t>
+      </w:r>
+    </w:p>
+    <w:p>
+      <w:r>
+        <w:t xml:space="preserve">****Flareon, Lv. 86</w:t>
+      </w:r>
+    </w:p>
+    <w:p>
+      <w:r>
+        <w:t xml:space="preserve">****Flareon, Lv. 86</w:t>
+      </w:r>
+    </w:p>
+    <w:p>
+      <w:r>
+        <w:t xml:space="preserve">*** Leader Blaine</w:t>
+      </w:r>
+    </w:p>
+    <w:p>
+      <w:r>
+        <w:t xml:space="preserve">****Rapidash, Lv. 86</w:t>
+      </w:r>
+    </w:p>
+    <w:p>
+      <w:r>
+        <w:t xml:space="preserve">****Ninetales, Lv. 86</w:t>
+      </w:r>
+    </w:p>
+    <w:p>
+      <w:r>
+        <w:t xml:space="preserve">****Magmar, Lv. 87</w:t>
+      </w:r>
+    </w:p>
+    <w:p>
+      <w:r>
+        <w:t xml:space="preserve">****Arcanine, Lv. 87</w:t>
+      </w:r>
+    </w:p>
+    <w:p>
+      <w:r>
+        <w:t xml:space="preserve">****Charizard, Lv. 88</w:t>
+      </w:r>
+    </w:p>
+    <w:p>
+      <w:r>
+        <w:t xml:space="preserve">* Gym 16 / Ground (Q=1.95 IV=120)</w:t>
+      </w:r>
+    </w:p>
+    <w:p>
+      <w:r>
+        <w:t xml:space="preserve">** Total Gym Enemies: 4</w:t>
+      </w:r>
+    </w:p>
+    <w:p>
+      <w:r>
+        <w:t xml:space="preserve">*** Gym Trainer #1</w:t>
+      </w:r>
+    </w:p>
+    <w:p>
+      <w:r>
+        <w:t xml:space="preserve">****Sandslash, Lv. 86</w:t>
+      </w:r>
+    </w:p>
+    <w:p>
+      <w:r>
+        <w:t xml:space="preserve">****Dugtrio, Lv. 87</w:t>
+      </w:r>
+    </w:p>
+    <w:p>
+      <w:r>
+        <w:t xml:space="preserve">****Graveler, Lv. 87</w:t>
+      </w:r>
+    </w:p>
+    <w:p>
+      <w:r>
+        <w:t xml:space="preserve">*** Gym Trainer #2</w:t>
+      </w:r>
+    </w:p>
+    <w:p>
+      <w:r>
+        <w:t xml:space="preserve">****Cubone, Lv. 87</w:t>
+      </w:r>
+    </w:p>
+    <w:p>
+      <w:r>
+        <w:t xml:space="preserve">****Rhyhorn, Lv. 87</w:t>
+      </w:r>
+    </w:p>
+    <w:p>
+      <w:r>
+        <w:t xml:space="preserve">****Marowak, Lv. 88</w:t>
+      </w:r>
+    </w:p>
+    <w:p>
+      <w:r>
+        <w:t xml:space="preserve">*** Gym Trainer #3</w:t>
+      </w:r>
+    </w:p>
+    <w:p>
+      <w:r>
+        <w:t xml:space="preserve">****Sandshrew, Lv. 87</w:t>
+      </w:r>
+    </w:p>
+    <w:p>
+      <w:r>
+        <w:t xml:space="preserve">****Onix, Lv. 87</w:t>
+      </w:r>
+    </w:p>
+    <w:p>
+      <w:r>
+        <w:t xml:space="preserve">****Onix, Lv. 88</w:t>
+      </w:r>
+    </w:p>
+    <w:p>
+      <w:r>
+        <w:t xml:space="preserve">****Golem, Lv. 88</w:t>
+      </w:r>
+    </w:p>
+    <w:p>
+      <w:r>
+        <w:t xml:space="preserve">*** Leader Giovanni</w:t>
+      </w:r>
+    </w:p>
+    <w:p>
+      <w:r>
+        <w:t xml:space="preserve">****Onix, Lv. 87</w:t>
+      </w:r>
+    </w:p>
+    <w:p>
+      <w:r>
+        <w:t xml:space="preserve">****Golem, Lv. 88</w:t>
+      </w:r>
+    </w:p>
+    <w:p>
+      <w:r>
+        <w:t xml:space="preserve">****Nidoqueen, Lv. 88</w:t>
+      </w:r>
+    </w:p>
+    <w:p>
+      <w:r>
+        <w:t xml:space="preserve">****Nidoking, Lv. 89</w:t>
+      </w:r>
+    </w:p>
+    <w:p>
+      <w:r>
+        <w:t xml:space="preserve">****Rhydon, Lv. 90</w:t>
       </w:r>
     </w:p>
     <w:sectPr>

</xml_diff>